<commit_message>
chore: Updated report format and added content to "Introduction to Artificial Intelligence/essay"
</commit_message>
<xml_diff>
--- a/Report Format.docx
+++ b/Report Format.docx
@@ -167,16 +167,16 @@
         <w:jc w:val="left"/>
         <w:rPr>
           <w:b/>
-          <w:sz w:val="32"/>
-          <w:szCs w:val="32"/>
+          <w:sz w:val="28"/>
+          <w:szCs w:val="28"/>
           <w:u w:val="single"/>
         </w:rPr>
       </w:pPr>
       <w:r>
         <w:rPr>
           <w:b/>
-          <w:sz w:val="32"/>
-          <w:szCs w:val="32"/>
+          <w:sz w:val="28"/>
+          <w:szCs w:val="28"/>
           <w:u w:val="single"/>
         </w:rPr>
         <w:t xml:space="preserve">Essay / Assignment Title: </w:t>
@@ -188,8 +188,8 @@
         <w:jc w:val="left"/>
         <w:rPr>
           <w:b/>
-          <w:sz w:val="32"/>
-          <w:szCs w:val="32"/>
+          <w:sz w:val="28"/>
+          <w:szCs w:val="28"/>
           <w:u w:val="single"/>
         </w:rPr>
       </w:pPr>
@@ -200,19 +200,30 @@
         <w:jc w:val="left"/>
         <w:rPr>
           <w:b/>
-          <w:sz w:val="32"/>
-          <w:szCs w:val="32"/>
+          <w:sz w:val="28"/>
+          <w:szCs w:val="28"/>
           <w:u w:val="single"/>
         </w:rPr>
       </w:pPr>
+      <w:proofErr w:type="spellStart"/>
       <w:r>
         <w:rPr>
           <w:b/>
-          <w:sz w:val="32"/>
-          <w:szCs w:val="32"/>
+          <w:sz w:val="28"/>
+          <w:szCs w:val="28"/>
           <w:u w:val="single"/>
         </w:rPr>
-        <w:t>Programme title:</w:t>
+        <w:t>Programme</w:t>
+      </w:r>
+      <w:proofErr w:type="spellEnd"/>
+      <w:r>
+        <w:rPr>
+          <w:b/>
+          <w:sz w:val="28"/>
+          <w:szCs w:val="28"/>
+          <w:u w:val="single"/>
+        </w:rPr>
+        <w:t xml:space="preserve"> title:</w:t>
       </w:r>
     </w:p>
     <w:p>
@@ -220,14 +231,14 @@
         <w:spacing w:line="360" w:lineRule="auto"/>
         <w:jc w:val="left"/>
         <w:rPr>
-          <w:b/>
-          <w:sz w:val="28"/>
-          <w:szCs w:val="28"/>
-        </w:rPr>
-      </w:pPr>
-      <w:r>
-        <w:rPr>
-          <w:b/>
+          <w:bCs/>
+          <w:sz w:val="28"/>
+          <w:szCs w:val="28"/>
+        </w:rPr>
+      </w:pPr>
+      <w:r>
+        <w:rPr>
+          <w:bCs/>
           <w:sz w:val="28"/>
           <w:szCs w:val="28"/>
         </w:rPr>
@@ -240,16 +251,16 @@
         <w:jc w:val="left"/>
         <w:rPr>
           <w:b/>
-          <w:sz w:val="32"/>
-          <w:szCs w:val="32"/>
+          <w:sz w:val="28"/>
+          <w:szCs w:val="28"/>
           <w:u w:val="single"/>
         </w:rPr>
       </w:pPr>
       <w:r>
         <w:rPr>
           <w:b/>
-          <w:sz w:val="32"/>
-          <w:szCs w:val="32"/>
+          <w:sz w:val="28"/>
+          <w:szCs w:val="28"/>
           <w:u w:val="single"/>
         </w:rPr>
         <w:t>Prepared by</w:t>
@@ -257,8 +268,8 @@
       <w:r>
         <w:rPr>
           <w:b/>
-          <w:sz w:val="32"/>
-          <w:szCs w:val="32"/>
+          <w:sz w:val="28"/>
+          <w:szCs w:val="28"/>
           <w:u w:val="single"/>
         </w:rPr>
         <w:t>:</w:t>
@@ -269,14 +280,14 @@
         <w:spacing w:line="360" w:lineRule="auto"/>
         <w:jc w:val="left"/>
         <w:rPr>
-          <w:b/>
-          <w:sz w:val="28"/>
-          <w:szCs w:val="28"/>
-        </w:rPr>
-      </w:pPr>
-      <w:r>
-        <w:rPr>
-          <w:b/>
+          <w:bCs/>
+          <w:sz w:val="28"/>
+          <w:szCs w:val="28"/>
+        </w:rPr>
+      </w:pPr>
+      <w:r>
+        <w:rPr>
+          <w:bCs/>
           <w:sz w:val="28"/>
           <w:szCs w:val="28"/>
         </w:rPr>
@@ -289,16 +300,16 @@
         <w:jc w:val="left"/>
         <w:rPr>
           <w:b/>
-          <w:sz w:val="32"/>
-          <w:szCs w:val="32"/>
+          <w:sz w:val="28"/>
+          <w:szCs w:val="28"/>
           <w:u w:val="single"/>
         </w:rPr>
       </w:pPr>
       <w:r>
         <w:rPr>
           <w:b/>
-          <w:sz w:val="32"/>
-          <w:szCs w:val="32"/>
+          <w:sz w:val="28"/>
+          <w:szCs w:val="28"/>
           <w:u w:val="single"/>
         </w:rPr>
         <w:t>Year:</w:t>
@@ -309,14 +320,14 @@
         <w:spacing w:line="360" w:lineRule="auto"/>
         <w:jc w:val="left"/>
         <w:rPr>
-          <w:b/>
-          <w:sz w:val="28"/>
-          <w:szCs w:val="28"/>
-        </w:rPr>
-      </w:pPr>
-      <w:r>
-        <w:rPr>
-          <w:b/>
+          <w:bCs/>
+          <w:sz w:val="28"/>
+          <w:szCs w:val="28"/>
+        </w:rPr>
+      </w:pPr>
+      <w:r>
+        <w:rPr>
+          <w:bCs/>
           <w:sz w:val="28"/>
           <w:szCs w:val="28"/>
         </w:rPr>
@@ -324,7 +335,7 @@
       </w:r>
       <w:r>
         <w:rPr>
-          <w:b/>
+          <w:bCs/>
           <w:sz w:val="28"/>
           <w:szCs w:val="28"/>
         </w:rPr>
@@ -332,7 +343,7 @@
       </w:r>
       <w:r>
         <w:rPr>
-          <w:b/>
+          <w:bCs/>
           <w:sz w:val="28"/>
           <w:szCs w:val="28"/>
         </w:rPr>
@@ -345,19 +356,19 @@
         <w:jc w:val="left"/>
         <w:rPr>
           <w:b/>
-          <w:sz w:val="32"/>
-          <w:szCs w:val="32"/>
+          <w:sz w:val="28"/>
+          <w:szCs w:val="28"/>
           <w:u w:val="single"/>
         </w:rPr>
       </w:pPr>
       <w:r>
         <w:rPr>
           <w:b/>
-          <w:sz w:val="32"/>
-          <w:szCs w:val="32"/>
+          <w:sz w:val="28"/>
+          <w:szCs w:val="28"/>
           <w:u w:val="single"/>
         </w:rPr>
-        <w:t>Date:</w:t>
+        <w:t>Submission Date:</w:t>
       </w:r>
     </w:p>
     <w:p>
@@ -365,42 +376,55 @@
         <w:spacing w:line="360" w:lineRule="auto"/>
         <w:jc w:val="left"/>
         <w:rPr>
+          <w:bCs/>
+          <w:sz w:val="28"/>
+          <w:szCs w:val="28"/>
+        </w:rPr>
+      </w:pPr>
+      <w:r>
+        <w:rPr>
+          <w:bCs/>
+          <w:sz w:val="28"/>
+          <w:szCs w:val="28"/>
+        </w:rPr>
+        <w:t>17 / June / 2026</w:t>
+      </w:r>
+    </w:p>
+    <w:p>
+      <w:pPr>
+        <w:spacing w:line="360" w:lineRule="auto"/>
+        <w:jc w:val="left"/>
+        <w:rPr>
           <w:b/>
-          <w:sz w:val="32"/>
-          <w:szCs w:val="32"/>
+          <w:bCs/>
+          <w:sz w:val="28"/>
+          <w:szCs w:val="28"/>
           <w:u w:val="single"/>
         </w:rPr>
       </w:pPr>
       <w:r>
         <w:rPr>
           <w:b/>
-          <w:sz w:val="28"/>
-          <w:szCs w:val="28"/>
-        </w:rPr>
-        <w:t>27 / May /</w:t>
-      </w:r>
-      <w:r>
-        <w:rPr>
-          <w:b/>
-          <w:sz w:val="28"/>
-          <w:szCs w:val="28"/>
-        </w:rPr>
-        <w:t xml:space="preserve"> 2026</w:t>
-      </w:r>
-    </w:p>
-    <w:p>
-      <w:pPr>
-        <w:jc w:val="center"/>
-        <w:rPr>
-          <w:sz w:val="32"/>
-          <w:szCs w:val="32"/>
-        </w:rPr>
-      </w:pPr>
-    </w:p>
-    <w:p>
-      <w:pPr>
-        <w:jc w:val="center"/>
-      </w:pPr>
+          <w:bCs/>
+          <w:sz w:val="28"/>
+          <w:szCs w:val="28"/>
+          <w:u w:val="single"/>
+        </w:rPr>
+        <w:t xml:space="preserve">Issued by: </w:t>
+      </w:r>
+    </w:p>
+    <w:p>
+      <w:pPr>
+        <w:spacing w:line="360" w:lineRule="auto"/>
+        <w:jc w:val="left"/>
+      </w:pPr>
+      <w:r>
+        <w:rPr>
+          <w:sz w:val="28"/>
+          <w:szCs w:val="28"/>
+        </w:rPr>
+        <w:t xml:space="preserve">Dr. </w:t>
+      </w:r>
     </w:p>
     <w:p>
       <w:pPr>
@@ -425,33 +449,23 @@
       <w:r>
         <w:br w:type="page"/>
       </w:r>
-      <w:r>
-        <w:lastRenderedPageBreak/>
-        <w:t>Executive Summary</w:t>
-      </w:r>
-    </w:p>
-    <w:p>
-      <w:pPr>
-        <w:spacing w:after="160"/>
-        <w:jc w:val="left"/>
-        <w:rPr>
-          <w:rFonts w:eastAsiaTheme="majorEastAsia" w:cstheme="majorBidi"/>
+    </w:p>
+    <w:p>
+      <w:pPr>
+        <w:rPr>
           <w:b/>
-          <w:color w:val="000000" w:themeColor="text1"/>
-          <w:sz w:val="32"/>
-          <w:szCs w:val="40"/>
-        </w:rPr>
-      </w:pPr>
-      <w:r>
-        <w:br w:type="page"/>
-      </w:r>
-    </w:p>
-    <w:p>
-      <w:pPr>
-        <w:pStyle w:val="Heading1"/>
-        <w:spacing w:before="0"/>
-      </w:pPr>
-      <w:r>
+          <w:bCs/>
+          <w:sz w:val="28"/>
+          <w:szCs w:val="28"/>
+        </w:rPr>
+      </w:pPr>
+      <w:r>
+        <w:rPr>
+          <w:b/>
+          <w:bCs/>
+          <w:sz w:val="28"/>
+          <w:szCs w:val="28"/>
+        </w:rPr>
         <w:lastRenderedPageBreak/>
         <w:t>Table of Contents</w:t>
       </w:r>
@@ -663,6 +677,21 @@
       </w:pPr>
       <w:r>
         <w:lastRenderedPageBreak/>
+        <w:t>Executive Summary</w:t>
+      </w:r>
+    </w:p>
+    <w:p>
+      <w:pPr>
+        <w:pStyle w:val="Heading1"/>
+        <w:spacing w:before="0"/>
+      </w:pPr>
+    </w:p>
+    <w:p>
+      <w:pPr>
+        <w:pStyle w:val="Heading1"/>
+        <w:spacing w:before="0"/>
+      </w:pPr>
+      <w:r>
         <w:t>Introduction</w:t>
       </w:r>
     </w:p>
@@ -1401,9 +1430,10 @@
     <w:basedOn w:val="Normal"/>
     <w:next w:val="Normal"/>
     <w:link w:val="Heading1Char"/>
+    <w:autoRedefine/>
     <w:uiPriority w:val="9"/>
     <w:qFormat/>
-    <w:rsid w:val="00283C68"/>
+    <w:rsid w:val="00CB4CA7"/>
     <w:pPr>
       <w:keepNext/>
       <w:keepLines/>
@@ -1414,7 +1444,7 @@
       <w:rFonts w:eastAsiaTheme="majorEastAsia" w:cstheme="majorBidi"/>
       <w:b/>
       <w:color w:val="000000" w:themeColor="text1"/>
-      <w:sz w:val="32"/>
+      <w:sz w:val="28"/>
       <w:szCs w:val="40"/>
     </w:rPr>
   </w:style>
@@ -1625,12 +1655,12 @@
     <w:basedOn w:val="DefaultParagraphFont"/>
     <w:link w:val="Heading1"/>
     <w:uiPriority w:val="9"/>
-    <w:rsid w:val="00283C68"/>
+    <w:rsid w:val="00CB4CA7"/>
     <w:rPr>
       <w:rFonts w:ascii="Times New Roman" w:eastAsiaTheme="majorEastAsia" w:hAnsi="Times New Roman" w:cstheme="majorBidi"/>
       <w:b/>
       <w:color w:val="000000" w:themeColor="text1"/>
-      <w:sz w:val="32"/>
+      <w:sz w:val="28"/>
       <w:szCs w:val="40"/>
     </w:rPr>
   </w:style>

</xml_diff>

<commit_message>
chore: minor formatting in report
</commit_message>
<xml_diff>
--- a/Report Format.docx
+++ b/Report Format.docx
@@ -14,8 +14,8 @@
           <w:noProof/>
         </w:rPr>
         <w:drawing>
-          <wp:inline distT="0" distB="0" distL="0" distR="0" wp14:anchorId="421473EE" wp14:editId="3B56E720">
-            <wp:extent cx="5731510" cy="1276985"/>
+          <wp:inline distT="0" distB="0" distL="0" distR="0" wp14:anchorId="421473EE" wp14:editId="5F10D0D5">
+            <wp:extent cx="5463540" cy="1217281"/>
             <wp:effectExtent l="0" t="0" r="0" b="0"/>
             <wp:docPr id="880059220" name="Picture 1" descr="Shape&#10;&#10;Description automatically generated with medium confidence"/>
             <wp:cNvGraphicFramePr>
@@ -46,7 +46,7 @@
                   <pic:spPr bwMode="auto">
                     <a:xfrm>
                       <a:off x="0" y="0"/>
-                      <a:ext cx="5731510" cy="1276985"/>
+                      <a:ext cx="5471708" cy="1219101"/>
                     </a:xfrm>
                     <a:prstGeom prst="rect">
                       <a:avLst/>
@@ -90,8 +90,8 @@
           <w:noProof/>
         </w:rPr>
         <w:drawing>
-          <wp:inline distT="0" distB="0" distL="0" distR="0" wp14:anchorId="0965AE87" wp14:editId="1CE5286B">
-            <wp:extent cx="2886075" cy="1819275"/>
+          <wp:inline distT="0" distB="0" distL="0" distR="0" wp14:anchorId="0965AE87" wp14:editId="0C1C8256">
+            <wp:extent cx="2842260" cy="1791656"/>
             <wp:effectExtent l="0" t="0" r="0" b="0"/>
             <wp:docPr id="857031257" name="Picture 2"/>
             <wp:cNvGraphicFramePr>
@@ -122,7 +122,7 @@
                   <pic:spPr bwMode="auto">
                     <a:xfrm>
                       <a:off x="0" y="0"/>
-                      <a:ext cx="2886075" cy="1819275"/>
+                      <a:ext cx="2843599" cy="1792500"/>
                     </a:xfrm>
                     <a:prstGeom prst="rect">
                       <a:avLst/>
@@ -141,6 +141,7 @@
     </w:p>
     <w:p>
       <w:pPr>
+        <w:jc w:val="center"/>
         <w:rPr>
           <w:noProof/>
         </w:rPr>
@@ -148,6 +149,7 @@
     </w:p>
     <w:p>
       <w:pPr>
+        <w:jc w:val="center"/>
         <w:rPr>
           <w:noProof/>
         </w:rPr>
@@ -155,14 +157,6 @@
     </w:p>
     <w:p>
       <w:pPr>
-        <w:jc w:val="center"/>
-        <w:rPr>
-          <w:noProof/>
-        </w:rPr>
-      </w:pPr>
-    </w:p>
-    <w:p>
-      <w:pPr>
         <w:spacing w:line="360" w:lineRule="auto"/>
         <w:jc w:val="left"/>
         <w:rPr>
@@ -205,7 +199,6 @@
           <w:u w:val="single"/>
         </w:rPr>
       </w:pPr>
-      <w:proofErr w:type="spellStart"/>
       <w:r>
         <w:rPr>
           <w:b/>
@@ -213,17 +206,56 @@
           <w:szCs w:val="28"/>
           <w:u w:val="single"/>
         </w:rPr>
-        <w:t>Programme</w:t>
-      </w:r>
-      <w:proofErr w:type="spellEnd"/>
-      <w:r>
+        <w:t>Programme title:</w:t>
+      </w:r>
+    </w:p>
+    <w:p>
+      <w:pPr>
+        <w:spacing w:line="360" w:lineRule="auto"/>
+        <w:jc w:val="left"/>
+        <w:rPr>
+          <w:bCs/>
+          <w:sz w:val="28"/>
+          <w:szCs w:val="28"/>
+        </w:rPr>
+      </w:pPr>
+      <w:r>
+        <w:rPr>
+          <w:bCs/>
+          <w:sz w:val="28"/>
+          <w:szCs w:val="28"/>
+        </w:rPr>
+        <w:t>MSc Artificial Intelligence</w:t>
+      </w:r>
+    </w:p>
+    <w:p>
+      <w:pPr>
+        <w:spacing w:line="360" w:lineRule="auto"/>
+        <w:jc w:val="left"/>
         <w:rPr>
           <w:b/>
           <w:sz w:val="28"/>
           <w:szCs w:val="28"/>
           <w:u w:val="single"/>
         </w:rPr>
-        <w:t xml:space="preserve"> title:</w:t>
+      </w:pPr>
+      <w:r>
+        <w:rPr>
+          <w:b/>
+          <w:sz w:val="28"/>
+          <w:szCs w:val="28"/>
+          <w:u w:val="single"/>
+        </w:rPr>
+        <w:t>Prepared by</w:t>
+      </w:r>
+      <w:r>
+        <w:rPr>
+          <w:b/>
+          <w:sz w:val="28"/>
+          <w:szCs w:val="28"/>
+          <w:u w:val="single"/>
+        </w:rPr>
+        <w:t>:</w:t>
       </w:r>
     </w:p>
     <w:p>
@@ -242,7 +274,7 @@
           <w:sz w:val="28"/>
           <w:szCs w:val="28"/>
         </w:rPr>
-        <w:t>MSc Artificial Intelligence</w:t>
+        <w:t>Amaan Mohammed Khalander</w:t>
       </w:r>
     </w:p>
     <w:p>
@@ -263,16 +295,55 @@
           <w:szCs w:val="28"/>
           <w:u w:val="single"/>
         </w:rPr>
-        <w:t>Prepared by</w:t>
-      </w:r>
-      <w:r>
+        <w:t>Module:</w:t>
+      </w:r>
+    </w:p>
+    <w:p>
+      <w:pPr>
+        <w:spacing w:line="360" w:lineRule="auto"/>
+        <w:jc w:val="left"/>
+        <w:rPr>
+          <w:bCs/>
+          <w:sz w:val="28"/>
+          <w:szCs w:val="28"/>
+        </w:rPr>
+      </w:pPr>
+      <w:r>
+        <w:rPr>
+          <w:bCs/>
+          <w:sz w:val="28"/>
+          <w:szCs w:val="28"/>
+        </w:rPr>
+        <w:t>COURSE NAME</w:t>
+      </w:r>
+      <w:r>
+        <w:rPr>
+          <w:bCs/>
+          <w:sz w:val="28"/>
+          <w:szCs w:val="28"/>
+        </w:rPr>
+        <w:t xml:space="preserve"> HERE</w:t>
+      </w:r>
+    </w:p>
+    <w:p>
+      <w:pPr>
+        <w:spacing w:line="360" w:lineRule="auto"/>
+        <w:jc w:val="left"/>
         <w:rPr>
           <w:b/>
           <w:sz w:val="28"/>
           <w:szCs w:val="28"/>
           <w:u w:val="single"/>
         </w:rPr>
-        <w:t>:</w:t>
+      </w:pPr>
+      <w:r>
+        <w:rPr>
+          <w:b/>
+          <w:sz w:val="28"/>
+          <w:szCs w:val="28"/>
+          <w:u w:val="single"/>
+        </w:rPr>
+        <w:t>Year:</w:t>
       </w:r>
     </w:p>
     <w:p>
@@ -291,47 +362,23 @@
           <w:sz w:val="28"/>
           <w:szCs w:val="28"/>
         </w:rPr>
-        <w:t>Amaan Mohammed Khalander</w:t>
-      </w:r>
-    </w:p>
-    <w:p>
-      <w:pPr>
-        <w:spacing w:line="360" w:lineRule="auto"/>
-        <w:jc w:val="left"/>
-        <w:rPr>
-          <w:b/>
-          <w:sz w:val="28"/>
-          <w:szCs w:val="28"/>
-          <w:u w:val="single"/>
-        </w:rPr>
-      </w:pPr>
-      <w:r>
-        <w:rPr>
-          <w:b/>
-          <w:sz w:val="28"/>
-          <w:szCs w:val="28"/>
-          <w:u w:val="single"/>
-        </w:rPr>
-        <w:t>Year:</w:t>
-      </w:r>
-    </w:p>
-    <w:p>
-      <w:pPr>
-        <w:spacing w:line="360" w:lineRule="auto"/>
-        <w:jc w:val="left"/>
+        <w:t xml:space="preserve">Term </w:t>
+      </w:r>
+      <w:r>
         <w:rPr>
           <w:bCs/>
           <w:sz w:val="28"/>
           <w:szCs w:val="28"/>
         </w:rPr>
-      </w:pPr>
+        <w:t>2</w:t>
+      </w:r>
       <w:r>
         <w:rPr>
           <w:bCs/>
           <w:sz w:val="28"/>
           <w:szCs w:val="28"/>
         </w:rPr>
-        <w:t xml:space="preserve">Term 1 </w:t>
+        <w:t xml:space="preserve"> </w:t>
       </w:r>
       <w:r>
         <w:rPr>
@@ -417,6 +464,10 @@
       <w:pPr>
         <w:spacing w:line="360" w:lineRule="auto"/>
         <w:jc w:val="left"/>
+        <w:rPr>
+          <w:sz w:val="28"/>
+          <w:szCs w:val="28"/>
+        </w:rPr>
       </w:pPr>
       <w:r>
         <w:rPr>
@@ -428,30 +479,28 @@
     </w:p>
     <w:p>
       <w:pPr>
-        <w:jc w:val="center"/>
-      </w:pPr>
-    </w:p>
-    <w:p>
-      <w:pPr>
-        <w:jc w:val="center"/>
-      </w:pPr>
-    </w:p>
-    <w:p>
-      <w:pPr>
-        <w:jc w:val="center"/>
-      </w:pPr>
-    </w:p>
-    <w:p>
-      <w:pPr>
-        <w:pStyle w:val="Heading1"/>
-        <w:spacing w:before="0"/>
-      </w:pPr>
-      <w:r>
-        <w:br w:type="page"/>
-      </w:r>
-    </w:p>
-    <w:p>
-      <w:pPr>
+        <w:spacing w:line="360" w:lineRule="auto"/>
+        <w:jc w:val="left"/>
+        <w:rPr>
+          <w:sz w:val="28"/>
+          <w:szCs w:val="28"/>
+        </w:rPr>
+      </w:pPr>
+    </w:p>
+    <w:p>
+      <w:pPr>
+        <w:spacing w:line="360" w:lineRule="auto"/>
+        <w:jc w:val="left"/>
+        <w:rPr>
+          <w:sz w:val="28"/>
+          <w:szCs w:val="28"/>
+        </w:rPr>
+      </w:pPr>
+    </w:p>
+    <w:p>
+      <w:pPr>
+        <w:spacing w:line="360" w:lineRule="auto"/>
+        <w:jc w:val="left"/>
         <w:rPr>
           <w:b/>
           <w:bCs/>
@@ -487,15 +536,15 @@
         <w:rPr>
           <w:rFonts w:ascii="Times New Roman Bold" w:hAnsi="Times New Roman Bold"/>
           <w:b/>
-          <w:sz w:val="30"/>
-          <w:szCs w:val="32"/>
+          <w:sz w:val="28"/>
+          <w:szCs w:val="28"/>
         </w:rPr>
       </w:pPr>
       <w:r>
         <w:rPr>
           <w:b/>
-          <w:sz w:val="32"/>
-          <w:szCs w:val="32"/>
+          <w:sz w:val="28"/>
+          <w:szCs w:val="28"/>
         </w:rPr>
         <w:lastRenderedPageBreak/>
         <w:t>Statement of compliance with academic ethics and the avoidance of plagiarism</w:t>

</xml_diff>

<commit_message>
Add project report for AI assignment
</commit_message>
<xml_diff>
--- a/Report Format.docx
+++ b/Report Format.docx
@@ -199,6 +199,7 @@
           <w:u w:val="single"/>
         </w:rPr>
       </w:pPr>
+      <w:proofErr w:type="spellStart"/>
       <w:r>
         <w:rPr>
           <w:b/>
@@ -206,7 +207,17 @@
           <w:szCs w:val="28"/>
           <w:u w:val="single"/>
         </w:rPr>
-        <w:t>Programme title:</w:t>
+        <w:t>Programme</w:t>
+      </w:r>
+      <w:proofErr w:type="spellEnd"/>
+      <w:r>
+        <w:rPr>
+          <w:b/>
+          <w:sz w:val="28"/>
+          <w:szCs w:val="28"/>
+          <w:u w:val="single"/>
+        </w:rPr>
+        <w:t xml:space="preserve"> title:</w:t>
       </w:r>
     </w:p>
     <w:p>
@@ -490,6 +501,929 @@
     <w:p>
       <w:pPr>
         <w:spacing w:line="360" w:lineRule="auto"/>
+        <w:jc w:val="left"/>
+        <w:rPr>
+          <w:sz w:val="28"/>
+          <w:szCs w:val="28"/>
+        </w:rPr>
+      </w:pPr>
+    </w:p>
+    <w:p>
+      <w:pPr>
+        <w:spacing w:after="160"/>
+        <w:jc w:val="left"/>
+        <w:rPr>
+          <w:rFonts w:eastAsiaTheme="majorEastAsia" w:cstheme="majorBidi"/>
+          <w:b/>
+          <w:color w:val="000000" w:themeColor="text1"/>
+          <w:sz w:val="32"/>
+          <w:szCs w:val="40"/>
+        </w:rPr>
+      </w:pPr>
+      <w:r>
+        <w:rPr>
+          <w:sz w:val="28"/>
+          <w:szCs w:val="28"/>
+        </w:rPr>
+        <w:br w:type="page"/>
+      </w:r>
+      <w:r>
+        <w:rPr>
+          <w:rFonts w:eastAsiaTheme="majorEastAsia" w:cstheme="majorBidi"/>
+          <w:b/>
+          <w:color w:val="000000" w:themeColor="text1"/>
+          <w:sz w:val="28"/>
+          <w:szCs w:val="36"/>
+        </w:rPr>
+        <w:lastRenderedPageBreak/>
+        <w:t>Learner declaration</w:t>
+      </w:r>
+    </w:p>
+    <w:tbl>
+      <w:tblPr>
+        <w:tblW w:w="5000" w:type="pct"/>
+        <w:tblCellMar>
+          <w:top w:w="15" w:type="dxa"/>
+          <w:left w:w="15" w:type="dxa"/>
+          <w:bottom w:w="15" w:type="dxa"/>
+          <w:right w:w="15" w:type="dxa"/>
+        </w:tblCellMar>
+        <w:tblLook w:val="04A0" w:firstRow="1" w:lastRow="0" w:firstColumn="1" w:lastColumn="0" w:noHBand="0" w:noVBand="1"/>
+      </w:tblPr>
+      <w:tblGrid>
+        <w:gridCol w:w="6401"/>
+        <w:gridCol w:w="2609"/>
+      </w:tblGrid>
+      <w:tr>
+        <w:trPr>
+          <w:tblHeader/>
+        </w:trPr>
+        <w:tc>
+          <w:tcPr>
+            <w:tcW w:w="0" w:type="auto"/>
+            <w:tcBorders>
+              <w:top w:val="single" w:sz="6" w:space="0" w:color="DDDDDD"/>
+              <w:left w:val="single" w:sz="6" w:space="0" w:color="DDDDDD"/>
+              <w:bottom w:val="single" w:sz="6" w:space="0" w:color="DDDDDD"/>
+              <w:right w:val="single" w:sz="6" w:space="0" w:color="DDDDDD"/>
+            </w:tcBorders>
+            <w:shd w:val="clear" w:color="auto" w:fill="F2F2F2"/>
+            <w:tcMar>
+              <w:top w:w="120" w:type="dxa"/>
+              <w:left w:w="120" w:type="dxa"/>
+              <w:bottom w:w="120" w:type="dxa"/>
+              <w:right w:w="120" w:type="dxa"/>
+            </w:tcMar>
+            <w:vAlign w:val="center"/>
+            <w:hideMark/>
+          </w:tcPr>
+          <w:p>
+            <w:pPr>
+              <w:jc w:val="left"/>
+              <w:rPr>
+                <w:rFonts w:eastAsiaTheme="majorEastAsia" w:cstheme="majorBidi"/>
+                <w:b/>
+                <w:bCs/>
+                <w:color w:val="000000" w:themeColor="text1"/>
+              </w:rPr>
+            </w:pPr>
+            <w:r>
+              <w:rPr>
+                <w:rFonts w:eastAsiaTheme="majorEastAsia" w:cstheme="majorBidi"/>
+                <w:b/>
+                <w:bCs/>
+                <w:color w:val="000000" w:themeColor="text1"/>
+              </w:rPr>
+              <w:t>Item</w:t>
+            </w:r>
+          </w:p>
+        </w:tc>
+        <w:tc>
+          <w:tcPr>
+            <w:tcW w:w="0" w:type="auto"/>
+            <w:tcBorders>
+              <w:top w:val="single" w:sz="6" w:space="0" w:color="DDDDDD"/>
+              <w:left w:val="single" w:sz="6" w:space="0" w:color="DDDDDD"/>
+              <w:bottom w:val="single" w:sz="6" w:space="0" w:color="DDDDDD"/>
+              <w:right w:val="single" w:sz="6" w:space="0" w:color="DDDDDD"/>
+            </w:tcBorders>
+            <w:shd w:val="clear" w:color="auto" w:fill="F2F2F2"/>
+            <w:tcMar>
+              <w:top w:w="120" w:type="dxa"/>
+              <w:left w:w="120" w:type="dxa"/>
+              <w:bottom w:w="120" w:type="dxa"/>
+              <w:right w:w="120" w:type="dxa"/>
+            </w:tcMar>
+            <w:vAlign w:val="center"/>
+            <w:hideMark/>
+          </w:tcPr>
+          <w:p>
+            <w:pPr>
+              <w:jc w:val="left"/>
+              <w:rPr>
+                <w:rFonts w:eastAsiaTheme="majorEastAsia" w:cstheme="majorBidi"/>
+                <w:b/>
+                <w:bCs/>
+                <w:color w:val="000000" w:themeColor="text1"/>
+              </w:rPr>
+            </w:pPr>
+            <w:r>
+              <w:rPr>
+                <w:rFonts w:eastAsiaTheme="majorEastAsia" w:cstheme="majorBidi"/>
+                <w:b/>
+                <w:bCs/>
+                <w:color w:val="000000" w:themeColor="text1"/>
+              </w:rPr>
+              <w:t>Response</w:t>
+            </w:r>
+          </w:p>
+        </w:tc>
+      </w:tr>
+      <w:tr>
+        <w:tc>
+          <w:tcPr>
+            <w:tcW w:w="0" w:type="auto"/>
+            <w:tcBorders>
+              <w:top w:val="single" w:sz="6" w:space="0" w:color="DDDDDD"/>
+              <w:left w:val="single" w:sz="6" w:space="0" w:color="DDDDDD"/>
+              <w:bottom w:val="single" w:sz="6" w:space="0" w:color="DDDDDD"/>
+              <w:right w:val="single" w:sz="6" w:space="0" w:color="DDDDDD"/>
+            </w:tcBorders>
+            <w:tcMar>
+              <w:top w:w="120" w:type="dxa"/>
+              <w:left w:w="120" w:type="dxa"/>
+              <w:bottom w:w="120" w:type="dxa"/>
+              <w:right w:w="120" w:type="dxa"/>
+            </w:tcMar>
+            <w:vAlign w:val="center"/>
+            <w:hideMark/>
+          </w:tcPr>
+          <w:p>
+            <w:pPr>
+              <w:jc w:val="left"/>
+              <w:rPr>
+                <w:rFonts w:eastAsiaTheme="majorEastAsia" w:cstheme="majorBidi"/>
+                <w:color w:val="000000" w:themeColor="text1"/>
+              </w:rPr>
+            </w:pPr>
+            <w:r>
+              <w:rPr>
+                <w:rFonts w:eastAsiaTheme="majorEastAsia" w:cstheme="majorBidi"/>
+                <w:color w:val="000000" w:themeColor="text1"/>
+              </w:rPr>
+              <w:t>Word count</w:t>
+            </w:r>
+          </w:p>
+        </w:tc>
+        <w:tc>
+          <w:tcPr>
+            <w:tcW w:w="0" w:type="auto"/>
+            <w:tcBorders>
+              <w:top w:val="single" w:sz="6" w:space="0" w:color="DDDDDD"/>
+              <w:left w:val="single" w:sz="6" w:space="0" w:color="DDDDDD"/>
+              <w:bottom w:val="single" w:sz="6" w:space="0" w:color="DDDDDD"/>
+              <w:right w:val="single" w:sz="6" w:space="0" w:color="DDDDDD"/>
+            </w:tcBorders>
+            <w:tcMar>
+              <w:top w:w="120" w:type="dxa"/>
+              <w:left w:w="120" w:type="dxa"/>
+              <w:bottom w:w="120" w:type="dxa"/>
+              <w:right w:w="120" w:type="dxa"/>
+            </w:tcMar>
+            <w:vAlign w:val="center"/>
+            <w:hideMark/>
+          </w:tcPr>
+          <w:p>
+            <w:pPr>
+              <w:jc w:val="left"/>
+              <w:rPr>
+                <w:rFonts w:eastAsiaTheme="majorEastAsia" w:cstheme="majorBidi"/>
+                <w:color w:val="000000" w:themeColor="text1"/>
+              </w:rPr>
+            </w:pPr>
+            <w:r>
+              <w:rPr>
+                <w:rFonts w:eastAsiaTheme="majorEastAsia" w:cstheme="majorBidi"/>
+                <w:color w:val="000000" w:themeColor="text1"/>
+              </w:rPr>
+              <w:t>WORD COUNT HERE IN NUMBER (1424)</w:t>
+            </w:r>
+          </w:p>
+        </w:tc>
+      </w:tr>
+      <w:tr>
+        <w:tc>
+          <w:tcPr>
+            <w:tcW w:w="0" w:type="auto"/>
+            <w:tcBorders>
+              <w:top w:val="single" w:sz="6" w:space="0" w:color="DDDDDD"/>
+              <w:left w:val="single" w:sz="6" w:space="0" w:color="DDDDDD"/>
+              <w:bottom w:val="single" w:sz="6" w:space="0" w:color="DDDDDD"/>
+              <w:right w:val="single" w:sz="6" w:space="0" w:color="DDDDDD"/>
+            </w:tcBorders>
+            <w:tcMar>
+              <w:top w:w="120" w:type="dxa"/>
+              <w:left w:w="120" w:type="dxa"/>
+              <w:bottom w:w="120" w:type="dxa"/>
+              <w:right w:w="120" w:type="dxa"/>
+            </w:tcMar>
+            <w:vAlign w:val="center"/>
+            <w:hideMark/>
+          </w:tcPr>
+          <w:p>
+            <w:pPr>
+              <w:jc w:val="left"/>
+              <w:rPr>
+                <w:rFonts w:eastAsiaTheme="majorEastAsia" w:cstheme="majorBidi"/>
+                <w:color w:val="000000" w:themeColor="text1"/>
+              </w:rPr>
+            </w:pPr>
+            <w:r>
+              <w:rPr>
+                <w:rFonts w:eastAsiaTheme="majorEastAsia" w:cstheme="majorBidi"/>
+                <w:color w:val="000000" w:themeColor="text1"/>
+              </w:rPr>
+              <w:t>Use of proof-reader/proof-reading service</w:t>
+            </w:r>
+          </w:p>
+        </w:tc>
+        <w:tc>
+          <w:tcPr>
+            <w:tcW w:w="0" w:type="auto"/>
+            <w:tcBorders>
+              <w:top w:val="single" w:sz="6" w:space="0" w:color="DDDDDD"/>
+              <w:left w:val="single" w:sz="6" w:space="0" w:color="DDDDDD"/>
+              <w:bottom w:val="single" w:sz="6" w:space="0" w:color="DDDDDD"/>
+              <w:right w:val="single" w:sz="6" w:space="0" w:color="DDDDDD"/>
+            </w:tcBorders>
+            <w:tcMar>
+              <w:top w:w="120" w:type="dxa"/>
+              <w:left w:w="120" w:type="dxa"/>
+              <w:bottom w:w="120" w:type="dxa"/>
+              <w:right w:w="120" w:type="dxa"/>
+            </w:tcMar>
+            <w:vAlign w:val="center"/>
+            <w:hideMark/>
+          </w:tcPr>
+          <w:p>
+            <w:pPr>
+              <w:jc w:val="left"/>
+              <w:rPr>
+                <w:rFonts w:eastAsiaTheme="majorEastAsia" w:cstheme="majorBidi"/>
+                <w:color w:val="000000" w:themeColor="text1"/>
+              </w:rPr>
+            </w:pPr>
+            <w:r>
+              <w:rPr>
+                <w:rFonts w:eastAsiaTheme="majorEastAsia" w:cstheme="majorBidi"/>
+                <w:color w:val="000000" w:themeColor="text1"/>
+              </w:rPr>
+              <w:t>NO</w:t>
+            </w:r>
+          </w:p>
+        </w:tc>
+      </w:tr>
+      <w:tr>
+        <w:tc>
+          <w:tcPr>
+            <w:tcW w:w="0" w:type="auto"/>
+            <w:tcBorders>
+              <w:top w:val="single" w:sz="6" w:space="0" w:color="DDDDDD"/>
+              <w:left w:val="single" w:sz="6" w:space="0" w:color="DDDDDD"/>
+              <w:bottom w:val="single" w:sz="6" w:space="0" w:color="DDDDDD"/>
+              <w:right w:val="single" w:sz="6" w:space="0" w:color="DDDDDD"/>
+            </w:tcBorders>
+            <w:tcMar>
+              <w:top w:w="120" w:type="dxa"/>
+              <w:left w:w="120" w:type="dxa"/>
+              <w:bottom w:w="120" w:type="dxa"/>
+              <w:right w:w="120" w:type="dxa"/>
+            </w:tcMar>
+            <w:vAlign w:val="center"/>
+            <w:hideMark/>
+          </w:tcPr>
+          <w:p>
+            <w:pPr>
+              <w:jc w:val="left"/>
+              <w:rPr>
+                <w:rFonts w:eastAsiaTheme="majorEastAsia" w:cstheme="majorBidi"/>
+                <w:color w:val="000000" w:themeColor="text1"/>
+              </w:rPr>
+            </w:pPr>
+            <w:r>
+              <w:rPr>
+                <w:rFonts w:eastAsiaTheme="majorEastAsia" w:cstheme="majorBidi"/>
+                <w:color w:val="000000" w:themeColor="text1"/>
+              </w:rPr>
+              <w:t>If yes, specify which service</w:t>
+            </w:r>
+          </w:p>
+        </w:tc>
+        <w:tc>
+          <w:tcPr>
+            <w:tcW w:w="0" w:type="auto"/>
+            <w:tcBorders>
+              <w:top w:val="single" w:sz="6" w:space="0" w:color="DDDDDD"/>
+              <w:left w:val="single" w:sz="6" w:space="0" w:color="DDDDDD"/>
+              <w:bottom w:val="single" w:sz="6" w:space="0" w:color="DDDDDD"/>
+              <w:right w:val="single" w:sz="6" w:space="0" w:color="DDDDDD"/>
+            </w:tcBorders>
+            <w:tcMar>
+              <w:top w:w="120" w:type="dxa"/>
+              <w:left w:w="120" w:type="dxa"/>
+              <w:bottom w:w="120" w:type="dxa"/>
+              <w:right w:w="120" w:type="dxa"/>
+            </w:tcMar>
+            <w:vAlign w:val="center"/>
+            <w:hideMark/>
+          </w:tcPr>
+          <w:p>
+            <w:pPr>
+              <w:jc w:val="left"/>
+              <w:rPr>
+                <w:rFonts w:eastAsiaTheme="majorEastAsia" w:cstheme="majorBidi"/>
+                <w:color w:val="000000" w:themeColor="text1"/>
+              </w:rPr>
+            </w:pPr>
+            <w:r>
+              <w:rPr>
+                <w:rFonts w:eastAsiaTheme="majorEastAsia" w:cstheme="majorBidi"/>
+                <w:color w:val="000000" w:themeColor="text1"/>
+              </w:rPr>
+              <w:t>N/A</w:t>
+            </w:r>
+          </w:p>
+        </w:tc>
+      </w:tr>
+      <w:tr>
+        <w:tc>
+          <w:tcPr>
+            <w:tcW w:w="0" w:type="auto"/>
+            <w:tcBorders>
+              <w:top w:val="single" w:sz="6" w:space="0" w:color="DDDDDD"/>
+              <w:left w:val="single" w:sz="6" w:space="0" w:color="DDDDDD"/>
+              <w:bottom w:val="single" w:sz="6" w:space="0" w:color="DDDDDD"/>
+              <w:right w:val="single" w:sz="6" w:space="0" w:color="DDDDDD"/>
+            </w:tcBorders>
+            <w:tcMar>
+              <w:top w:w="120" w:type="dxa"/>
+              <w:left w:w="120" w:type="dxa"/>
+              <w:bottom w:w="120" w:type="dxa"/>
+              <w:right w:w="120" w:type="dxa"/>
+            </w:tcMar>
+            <w:vAlign w:val="center"/>
+            <w:hideMark/>
+          </w:tcPr>
+          <w:p>
+            <w:pPr>
+              <w:jc w:val="left"/>
+              <w:rPr>
+                <w:rFonts w:eastAsiaTheme="majorEastAsia" w:cstheme="majorBidi"/>
+                <w:color w:val="000000" w:themeColor="text1"/>
+              </w:rPr>
+            </w:pPr>
+            <w:r>
+              <w:rPr>
+                <w:rFonts w:eastAsiaTheme="majorEastAsia" w:cstheme="majorBidi"/>
+                <w:color w:val="000000" w:themeColor="text1"/>
+              </w:rPr>
+              <w:t>I confirm that I submit this work as my own work and have cited all sources used</w:t>
+            </w:r>
+          </w:p>
+        </w:tc>
+        <w:tc>
+          <w:tcPr>
+            <w:tcW w:w="0" w:type="auto"/>
+            <w:tcBorders>
+              <w:top w:val="single" w:sz="6" w:space="0" w:color="DDDDDD"/>
+              <w:left w:val="single" w:sz="6" w:space="0" w:color="DDDDDD"/>
+              <w:bottom w:val="single" w:sz="6" w:space="0" w:color="DDDDDD"/>
+              <w:right w:val="single" w:sz="6" w:space="0" w:color="DDDDDD"/>
+            </w:tcBorders>
+            <w:tcMar>
+              <w:top w:w="120" w:type="dxa"/>
+              <w:left w:w="120" w:type="dxa"/>
+              <w:bottom w:w="120" w:type="dxa"/>
+              <w:right w:w="120" w:type="dxa"/>
+            </w:tcMar>
+            <w:vAlign w:val="center"/>
+            <w:hideMark/>
+          </w:tcPr>
+          <w:p>
+            <w:pPr>
+              <w:jc w:val="left"/>
+              <w:rPr>
+                <w:rFonts w:eastAsiaTheme="majorEastAsia" w:cstheme="majorBidi"/>
+                <w:color w:val="000000" w:themeColor="text1"/>
+              </w:rPr>
+            </w:pPr>
+            <w:r>
+              <w:rPr>
+                <w:rFonts w:eastAsiaTheme="majorEastAsia" w:cstheme="majorBidi"/>
+                <w:color w:val="000000" w:themeColor="text1"/>
+              </w:rPr>
+              <w:t>YES</w:t>
+            </w:r>
+          </w:p>
+        </w:tc>
+      </w:tr>
+      <w:tr>
+        <w:tc>
+          <w:tcPr>
+            <w:tcW w:w="0" w:type="auto"/>
+            <w:tcBorders>
+              <w:top w:val="single" w:sz="6" w:space="0" w:color="DDDDDD"/>
+              <w:left w:val="single" w:sz="6" w:space="0" w:color="DDDDDD"/>
+              <w:bottom w:val="single" w:sz="6" w:space="0" w:color="DDDDDD"/>
+              <w:right w:val="single" w:sz="6" w:space="0" w:color="DDDDDD"/>
+            </w:tcBorders>
+            <w:tcMar>
+              <w:top w:w="120" w:type="dxa"/>
+              <w:left w:w="120" w:type="dxa"/>
+              <w:bottom w:w="120" w:type="dxa"/>
+              <w:right w:w="120" w:type="dxa"/>
+            </w:tcMar>
+            <w:vAlign w:val="center"/>
+            <w:hideMark/>
+          </w:tcPr>
+          <w:p>
+            <w:pPr>
+              <w:jc w:val="left"/>
+              <w:rPr>
+                <w:rFonts w:eastAsiaTheme="majorEastAsia" w:cstheme="majorBidi"/>
+                <w:color w:val="000000" w:themeColor="text1"/>
+              </w:rPr>
+            </w:pPr>
+            <w:r>
+              <w:rPr>
+                <w:rFonts w:eastAsiaTheme="majorEastAsia" w:cstheme="majorBidi"/>
+                <w:color w:val="000000" w:themeColor="text1"/>
+              </w:rPr>
+              <w:t>I confirm that I have followed guidance on the acceptable use of AI tools for this assignment</w:t>
+            </w:r>
+          </w:p>
+        </w:tc>
+        <w:tc>
+          <w:tcPr>
+            <w:tcW w:w="0" w:type="auto"/>
+            <w:tcBorders>
+              <w:top w:val="single" w:sz="6" w:space="0" w:color="DDDDDD"/>
+              <w:left w:val="single" w:sz="6" w:space="0" w:color="DDDDDD"/>
+              <w:bottom w:val="single" w:sz="6" w:space="0" w:color="DDDDDD"/>
+              <w:right w:val="single" w:sz="6" w:space="0" w:color="DDDDDD"/>
+            </w:tcBorders>
+            <w:tcMar>
+              <w:top w:w="120" w:type="dxa"/>
+              <w:left w:w="120" w:type="dxa"/>
+              <w:bottom w:w="120" w:type="dxa"/>
+              <w:right w:w="120" w:type="dxa"/>
+            </w:tcMar>
+            <w:vAlign w:val="center"/>
+            <w:hideMark/>
+          </w:tcPr>
+          <w:p>
+            <w:pPr>
+              <w:jc w:val="left"/>
+              <w:rPr>
+                <w:rFonts w:eastAsiaTheme="majorEastAsia" w:cstheme="majorBidi"/>
+                <w:color w:val="000000" w:themeColor="text1"/>
+              </w:rPr>
+            </w:pPr>
+            <w:r>
+              <w:rPr>
+                <w:rFonts w:eastAsiaTheme="majorEastAsia" w:cstheme="majorBidi"/>
+                <w:color w:val="000000" w:themeColor="text1"/>
+              </w:rPr>
+              <w:t>YES</w:t>
+            </w:r>
+          </w:p>
+        </w:tc>
+      </w:tr>
+      <w:tr>
+        <w:tc>
+          <w:tcPr>
+            <w:tcW w:w="0" w:type="auto"/>
+            <w:tcBorders>
+              <w:top w:val="single" w:sz="6" w:space="0" w:color="DDDDDD"/>
+              <w:left w:val="single" w:sz="6" w:space="0" w:color="DDDDDD"/>
+              <w:bottom w:val="single" w:sz="6" w:space="0" w:color="DDDDDD"/>
+              <w:right w:val="single" w:sz="6" w:space="0" w:color="DDDDDD"/>
+            </w:tcBorders>
+            <w:tcMar>
+              <w:top w:w="120" w:type="dxa"/>
+              <w:left w:w="120" w:type="dxa"/>
+              <w:bottom w:w="120" w:type="dxa"/>
+              <w:right w:w="120" w:type="dxa"/>
+            </w:tcMar>
+            <w:vAlign w:val="center"/>
+            <w:hideMark/>
+          </w:tcPr>
+          <w:p>
+            <w:pPr>
+              <w:jc w:val="left"/>
+              <w:rPr>
+                <w:rFonts w:eastAsiaTheme="majorEastAsia" w:cstheme="majorBidi"/>
+                <w:color w:val="000000" w:themeColor="text1"/>
+              </w:rPr>
+            </w:pPr>
+            <w:r>
+              <w:rPr>
+                <w:rFonts w:eastAsiaTheme="majorEastAsia" w:cstheme="majorBidi"/>
+                <w:color w:val="000000" w:themeColor="text1"/>
+              </w:rPr>
+              <w:t>Where use of appropriately cited AI tools is permitted, I confirm that I have cited in accordance with the UCA Harvard Referencing Standard</w:t>
+            </w:r>
+          </w:p>
+        </w:tc>
+        <w:tc>
+          <w:tcPr>
+            <w:tcW w:w="0" w:type="auto"/>
+            <w:tcBorders>
+              <w:top w:val="single" w:sz="6" w:space="0" w:color="DDDDDD"/>
+              <w:left w:val="single" w:sz="6" w:space="0" w:color="DDDDDD"/>
+              <w:bottom w:val="single" w:sz="6" w:space="0" w:color="DDDDDD"/>
+              <w:right w:val="single" w:sz="6" w:space="0" w:color="DDDDDD"/>
+            </w:tcBorders>
+            <w:tcMar>
+              <w:top w:w="120" w:type="dxa"/>
+              <w:left w:w="120" w:type="dxa"/>
+              <w:bottom w:w="120" w:type="dxa"/>
+              <w:right w:w="120" w:type="dxa"/>
+            </w:tcMar>
+            <w:vAlign w:val="center"/>
+            <w:hideMark/>
+          </w:tcPr>
+          <w:p>
+            <w:pPr>
+              <w:jc w:val="left"/>
+              <w:rPr>
+                <w:rFonts w:eastAsiaTheme="majorEastAsia" w:cstheme="majorBidi"/>
+                <w:color w:val="000000" w:themeColor="text1"/>
+              </w:rPr>
+            </w:pPr>
+            <w:r>
+              <w:rPr>
+                <w:rFonts w:eastAsiaTheme="majorEastAsia" w:cstheme="majorBidi"/>
+                <w:color w:val="000000" w:themeColor="text1"/>
+              </w:rPr>
+              <w:t>YES</w:t>
+            </w:r>
+          </w:p>
+        </w:tc>
+      </w:tr>
+    </w:tbl>
+    <w:p>
+      <w:pPr>
+        <w:spacing w:after="160"/>
+        <w:jc w:val="left"/>
+        <w:rPr>
+          <w:rFonts w:eastAsiaTheme="majorEastAsia" w:cstheme="majorBidi"/>
+          <w:b/>
+          <w:color w:val="000000" w:themeColor="text1"/>
+          <w:sz w:val="32"/>
+          <w:szCs w:val="40"/>
+        </w:rPr>
+      </w:pPr>
+    </w:p>
+    <w:tbl>
+      <w:tblPr>
+        <w:tblW w:w="5000" w:type="pct"/>
+        <w:tblCellMar>
+          <w:top w:w="15" w:type="dxa"/>
+          <w:left w:w="15" w:type="dxa"/>
+          <w:bottom w:w="15" w:type="dxa"/>
+          <w:right w:w="15" w:type="dxa"/>
+        </w:tblCellMar>
+        <w:tblLook w:val="04A0" w:firstRow="1" w:lastRow="0" w:firstColumn="1" w:lastColumn="0" w:noHBand="0" w:noVBand="1"/>
+      </w:tblPr>
+      <w:tblGrid>
+        <w:gridCol w:w="5329"/>
+        <w:gridCol w:w="3681"/>
+      </w:tblGrid>
+      <w:tr>
+        <w:trPr>
+          <w:tblHeader/>
+        </w:trPr>
+        <w:tc>
+          <w:tcPr>
+            <w:tcW w:w="0" w:type="auto"/>
+            <w:tcBorders>
+              <w:top w:val="single" w:sz="6" w:space="0" w:color="DDDDDD"/>
+              <w:left w:val="single" w:sz="6" w:space="0" w:color="DDDDDD"/>
+              <w:bottom w:val="single" w:sz="6" w:space="0" w:color="DDDDDD"/>
+              <w:right w:val="single" w:sz="6" w:space="0" w:color="DDDDDD"/>
+            </w:tcBorders>
+            <w:shd w:val="clear" w:color="auto" w:fill="F2F2F2"/>
+            <w:tcMar>
+              <w:top w:w="120" w:type="dxa"/>
+              <w:left w:w="120" w:type="dxa"/>
+              <w:bottom w:w="120" w:type="dxa"/>
+              <w:right w:w="120" w:type="dxa"/>
+            </w:tcMar>
+            <w:vAlign w:val="center"/>
+            <w:hideMark/>
+          </w:tcPr>
+          <w:p>
+            <w:pPr>
+              <w:spacing w:after="160"/>
+              <w:jc w:val="left"/>
+              <w:rPr>
+                <w:rFonts w:eastAsiaTheme="majorEastAsia" w:cstheme="majorBidi"/>
+                <w:b/>
+                <w:bCs/>
+                <w:color w:val="000000" w:themeColor="text1"/>
+                <w:szCs w:val="32"/>
+              </w:rPr>
+            </w:pPr>
+            <w:r>
+              <w:rPr>
+                <w:rFonts w:eastAsiaTheme="majorEastAsia" w:cstheme="majorBidi"/>
+                <w:b/>
+                <w:bCs/>
+                <w:color w:val="000000" w:themeColor="text1"/>
+                <w:szCs w:val="32"/>
+              </w:rPr>
+              <w:t>Student signature</w:t>
+            </w:r>
+          </w:p>
+        </w:tc>
+        <w:tc>
+          <w:tcPr>
+            <w:tcW w:w="0" w:type="auto"/>
+            <w:tcBorders>
+              <w:top w:val="single" w:sz="6" w:space="0" w:color="DDDDDD"/>
+              <w:left w:val="single" w:sz="6" w:space="0" w:color="DDDDDD"/>
+              <w:bottom w:val="single" w:sz="6" w:space="0" w:color="DDDDDD"/>
+              <w:right w:val="single" w:sz="6" w:space="0" w:color="DDDDDD"/>
+            </w:tcBorders>
+            <w:shd w:val="clear" w:color="auto" w:fill="F2F2F2"/>
+            <w:tcMar>
+              <w:top w:w="120" w:type="dxa"/>
+              <w:left w:w="120" w:type="dxa"/>
+              <w:bottom w:w="120" w:type="dxa"/>
+              <w:right w:w="120" w:type="dxa"/>
+            </w:tcMar>
+            <w:vAlign w:val="center"/>
+            <w:hideMark/>
+          </w:tcPr>
+          <w:p>
+            <w:pPr>
+              <w:spacing w:after="160"/>
+              <w:jc w:val="left"/>
+              <w:rPr>
+                <w:rFonts w:eastAsiaTheme="majorEastAsia" w:cstheme="majorBidi"/>
+                <w:b/>
+                <w:bCs/>
+                <w:color w:val="000000" w:themeColor="text1"/>
+                <w:szCs w:val="32"/>
+              </w:rPr>
+            </w:pPr>
+            <w:r>
+              <w:rPr>
+                <w:rFonts w:eastAsiaTheme="majorEastAsia" w:cstheme="majorBidi"/>
+                <w:b/>
+                <w:bCs/>
+                <w:color w:val="000000" w:themeColor="text1"/>
+                <w:szCs w:val="32"/>
+              </w:rPr>
+              <w:t>Date</w:t>
+            </w:r>
+          </w:p>
+        </w:tc>
+      </w:tr>
+      <w:tr>
+        <w:tc>
+          <w:tcPr>
+            <w:tcW w:w="0" w:type="auto"/>
+            <w:tcBorders>
+              <w:top w:val="single" w:sz="6" w:space="0" w:color="DDDDDD"/>
+              <w:left w:val="single" w:sz="6" w:space="0" w:color="DDDDDD"/>
+              <w:bottom w:val="single" w:sz="6" w:space="0" w:color="DDDDDD"/>
+              <w:right w:val="single" w:sz="6" w:space="0" w:color="DDDDDD"/>
+            </w:tcBorders>
+            <w:tcMar>
+              <w:top w:w="120" w:type="dxa"/>
+              <w:left w:w="120" w:type="dxa"/>
+              <w:bottom w:w="120" w:type="dxa"/>
+              <w:right w:w="120" w:type="dxa"/>
+            </w:tcMar>
+            <w:vAlign w:val="center"/>
+            <w:hideMark/>
+          </w:tcPr>
+          <w:p>
+            <w:pPr>
+              <w:jc w:val="left"/>
+              <w:rPr>
+                <w:rFonts w:eastAsiaTheme="majorEastAsia" w:cstheme="majorBidi"/>
+                <w:b/>
+                <w:bCs/>
+                <w:color w:val="000000" w:themeColor="text1"/>
+              </w:rPr>
+            </w:pPr>
+            <w:r>
+              <w:rPr>
+                <w:noProof/>
+              </w:rPr>
+              <w:drawing>
+                <wp:inline distT="0" distB="0" distL="0" distR="0" wp14:anchorId="077D6C1E" wp14:editId="71A978DD">
+                  <wp:extent cx="1295138" cy="495300"/>
+                  <wp:effectExtent l="0" t="0" r="0" b="0"/>
+                  <wp:docPr id="1079849710" name="Picture 4"/>
+                  <wp:cNvGraphicFramePr>
+                    <a:graphicFrameLocks xmlns:a="http://schemas.openxmlformats.org/drawingml/2006/main" noChangeAspect="1"/>
+                  </wp:cNvGraphicFramePr>
+                  <a:graphic xmlns:a="http://schemas.openxmlformats.org/drawingml/2006/main">
+                    <a:graphicData uri="http://schemas.openxmlformats.org/drawingml/2006/picture">
+                      <pic:pic xmlns:pic="http://schemas.openxmlformats.org/drawingml/2006/picture">
+                        <pic:nvPicPr>
+                          <pic:cNvPr id="542859284" name="Picture 542859284"/>
+                          <pic:cNvPicPr/>
+                        </pic:nvPicPr>
+                        <pic:blipFill rotWithShape="1">
+                          <a:blip r:embed="rId9" cstate="print">
+                            <a:extLst>
+                              <a:ext uri="{28A0092B-C50C-407E-A947-70E740481C1C}">
+                                <a14:useLocalDpi xmlns:a14="http://schemas.microsoft.com/office/drawing/2010/main" val="0"/>
+                              </a:ext>
+                            </a:extLst>
+                          </a:blip>
+                          <a:srcRect t="16857" b="16493"/>
+                          <a:stretch>
+                            <a:fillRect/>
+                          </a:stretch>
+                        </pic:blipFill>
+                        <pic:spPr bwMode="auto">
+                          <a:xfrm>
+                            <a:off x="0" y="0"/>
+                            <a:ext cx="1318583" cy="504266"/>
+                          </a:xfrm>
+                          <a:prstGeom prst="rect">
+                            <a:avLst/>
+                          </a:prstGeom>
+                          <a:ln>
+                            <a:noFill/>
+                          </a:ln>
+                          <a:extLst>
+                            <a:ext uri="{53640926-AAD7-44D8-BBD7-CCE9431645EC}">
+                              <a14:shadowObscured xmlns:a14="http://schemas.microsoft.com/office/drawing/2010/main"/>
+                            </a:ext>
+                          </a:extLst>
+                        </pic:spPr>
+                      </pic:pic>
+                    </a:graphicData>
+                  </a:graphic>
+                </wp:inline>
+              </w:drawing>
+            </w:r>
+          </w:p>
+        </w:tc>
+        <w:tc>
+          <w:tcPr>
+            <w:tcW w:w="0" w:type="auto"/>
+            <w:tcBorders>
+              <w:top w:val="single" w:sz="6" w:space="0" w:color="DDDDDD"/>
+              <w:left w:val="single" w:sz="6" w:space="0" w:color="DDDDDD"/>
+              <w:bottom w:val="single" w:sz="6" w:space="0" w:color="DDDDDD"/>
+              <w:right w:val="single" w:sz="6" w:space="0" w:color="DDDDDD"/>
+            </w:tcBorders>
+            <w:tcMar>
+              <w:top w:w="120" w:type="dxa"/>
+              <w:left w:w="120" w:type="dxa"/>
+              <w:bottom w:w="120" w:type="dxa"/>
+              <w:right w:w="120" w:type="dxa"/>
+            </w:tcMar>
+            <w:vAlign w:val="center"/>
+            <w:hideMark/>
+          </w:tcPr>
+          <w:p>
+            <w:pPr>
+              <w:spacing w:line="360" w:lineRule="auto"/>
+              <w:jc w:val="left"/>
+              <w:rPr>
+                <w:bCs/>
+              </w:rPr>
+            </w:pPr>
+            <w:r>
+              <w:rPr>
+                <w:bCs/>
+              </w:rPr>
+              <w:t xml:space="preserve">10 / </w:t>
+            </w:r>
+            <w:r>
+              <w:rPr>
+                <w:bCs/>
+              </w:rPr>
+              <w:t>06</w:t>
+            </w:r>
+            <w:r>
+              <w:rPr>
+                <w:bCs/>
+              </w:rPr>
+              <w:t xml:space="preserve"> / 2026</w:t>
+            </w:r>
+          </w:p>
+        </w:tc>
+      </w:tr>
+    </w:tbl>
+    <w:p>
+      <w:pPr>
+        <w:spacing w:after="160"/>
+        <w:jc w:val="left"/>
+        <w:rPr>
+          <w:rFonts w:eastAsiaTheme="majorEastAsia" w:cstheme="majorBidi"/>
+          <w:b/>
+          <w:color w:val="000000" w:themeColor="text1"/>
+          <w:sz w:val="32"/>
+          <w:szCs w:val="40"/>
+        </w:rPr>
+      </w:pPr>
+    </w:p>
+    <w:p>
+      <w:pPr>
+        <w:spacing w:after="160"/>
+        <w:jc w:val="left"/>
+        <w:rPr>
+          <w:rFonts w:eastAsiaTheme="majorEastAsia" w:cstheme="majorBidi"/>
+          <w:b/>
+          <w:color w:val="000000" w:themeColor="text1"/>
+          <w:sz w:val="32"/>
+          <w:szCs w:val="40"/>
+        </w:rPr>
+      </w:pPr>
+    </w:p>
+    <w:p>
+      <w:pPr>
+        <w:spacing w:after="160"/>
+        <w:jc w:val="left"/>
+        <w:rPr>
+          <w:sz w:val="28"/>
+          <w:szCs w:val="28"/>
+        </w:rPr>
+      </w:pPr>
+    </w:p>
+    <w:p>
+      <w:pPr>
+        <w:spacing w:after="160"/>
+        <w:jc w:val="left"/>
+        <w:rPr>
+          <w:sz w:val="28"/>
+          <w:szCs w:val="28"/>
+        </w:rPr>
+      </w:pPr>
+    </w:p>
+    <w:p>
+      <w:pPr>
+        <w:spacing w:after="160"/>
+        <w:jc w:val="left"/>
+        <w:rPr>
+          <w:sz w:val="28"/>
+          <w:szCs w:val="28"/>
+        </w:rPr>
+      </w:pPr>
+    </w:p>
+    <w:p>
+      <w:pPr>
+        <w:spacing w:after="160"/>
+        <w:jc w:val="left"/>
+        <w:rPr>
+          <w:sz w:val="28"/>
+          <w:szCs w:val="28"/>
+        </w:rPr>
+      </w:pPr>
+    </w:p>
+    <w:p>
+      <w:pPr>
+        <w:spacing w:after="160"/>
+        <w:jc w:val="left"/>
+        <w:rPr>
+          <w:sz w:val="28"/>
+          <w:szCs w:val="28"/>
+        </w:rPr>
+      </w:pPr>
+    </w:p>
+    <w:p>
+      <w:pPr>
+        <w:spacing w:after="160"/>
+        <w:jc w:val="left"/>
+        <w:rPr>
+          <w:sz w:val="28"/>
+          <w:szCs w:val="28"/>
+        </w:rPr>
+      </w:pPr>
+    </w:p>
+    <w:p>
+      <w:pPr>
+        <w:spacing w:after="160"/>
+        <w:jc w:val="left"/>
+        <w:rPr>
+          <w:sz w:val="28"/>
+          <w:szCs w:val="28"/>
+        </w:rPr>
+      </w:pPr>
+    </w:p>
+    <w:p>
+      <w:pPr>
+        <w:spacing w:after="160"/>
         <w:jc w:val="left"/>
         <w:rPr>
           <w:sz w:val="28"/>
@@ -926,15 +1860,43 @@
     <w:p>
       <w:pPr>
         <w:pStyle w:val="Heading1"/>
-        <w:pageBreakBefore/>
-        <w:spacing w:before="0"/>
-        <w:rPr>
-          <w:lang w:val="el-GR"/>
-        </w:rPr>
       </w:pPr>
       <w:r>
         <w:lastRenderedPageBreak/>
-        <w:t>References</w:t>
+        <w:t>Acknowledgement</w:t>
+      </w:r>
+    </w:p>
+    <w:p>
+      <w:pPr>
+        <w:spacing w:before="240" w:line="360" w:lineRule="auto"/>
+      </w:pPr>
+      <w:r>
+        <w:t>Perplexity AI was used in the preparation of this report to support literature searching, identify potentially relevant academic sources, and assist with grammar correction and word-limit reduction during editing. All sources included in the reference list were checked by the author and cited as the original academic works rather than citing Perplexity AI as a source. The analysis, interpretation, discussion, and final written content submitted in this report are the author’s own work and responsibility.</w:t>
+      </w:r>
+    </w:p>
+    <w:p>
+      <w:pPr>
+        <w:spacing w:after="160"/>
+        <w:jc w:val="left"/>
+        <w:rPr>
+          <w:rFonts w:eastAsiaTheme="majorEastAsia" w:cstheme="majorBidi"/>
+          <w:b/>
+          <w:bCs/>
+          <w:color w:val="000000" w:themeColor="text1"/>
+          <w:sz w:val="28"/>
+          <w:szCs w:val="40"/>
+        </w:rPr>
+      </w:pPr>
+      <w:r>
+        <w:rPr>
+          <w:rFonts w:eastAsiaTheme="majorEastAsia" w:cstheme="majorBidi"/>
+          <w:b/>
+          <w:bCs/>
+          <w:color w:val="000000" w:themeColor="text1"/>
+          <w:sz w:val="28"/>
+          <w:szCs w:val="40"/>
+        </w:rPr>
+        <w:br w:type="page"/>
       </w:r>
     </w:p>
     <w:p>
@@ -942,7 +1904,14 @@
         <w:pStyle w:val="Heading1"/>
         <w:pageBreakBefore/>
         <w:spacing w:before="0"/>
-      </w:pPr>
+        <w:rPr>
+          <w:lang w:val="el-GR"/>
+        </w:rPr>
+      </w:pPr>
+      <w:r>
+        <w:lastRenderedPageBreak/>
+        <w:t>References</w:t>
+      </w:r>
     </w:p>
     <w:sectPr>
       <w:footerReference w:type="default" r:id="rId10"/>

</xml_diff>